<commit_message>
Prepare free showcase release and human review materials
</commit_message>
<xml_diff>
--- a/docs/Provider_Performance_Analytics_Full_Walkthrough.docx
+++ b/docs/Provider_Performance_Analytics_Full_Walkthrough.docx
@@ -3654,7 +3654,17 @@
         <w:t>Codex agent review scored 15/15 for v1 and 15/15 for v2 repetition 1</w:t>
       </w:r>
       <w:r>
-        <w:t xml:space="preserve">, checking scope, method, year, definitions, and numerical statements against returned results. These are agent reviews, not independent human reviews; human review remains pending. Case-by-case evidence and literal excerpts are retained in each completed run's </w:t>
+        <w:t xml:space="preserve">, checking scope, method, year, definitions, and numerical statements against returned results. These are agent reviews, not independent human reviews; human review remains pending. Use </w:t>
+      </w:r>
+      <w:r>
+        <w:rPr>
+          <w:rFonts w:ascii="DejaVu Sans Mono" w:hAnsi="DejaVu Sans Mono"/>
+          <w:sz w:val="18"/>
+        </w:rPr>
+        <w:t>docs/human_review_checklist.md</w:t>
+      </w:r>
+      <w:r>
+        <w:t xml:space="preserve"> and its 15-row CSV template to record an offline owner review. Case-by-case evidence and literal excerpts are retained in each completed run's </w:t>
       </w:r>
       <w:r>
         <w:rPr>
@@ -4211,7 +4221,7 @@
     </w:p>
     <w:p>
       <w:r>
-        <w:t>The static bundle contains six allowlisted files and no credentials. HF reported RUNNING with the static SDK. The deployment checkpoint passed 143 database-enabled tests; the final hardened code passed 156 database-enabled tests on October 16, 2026. A browser walkthrough verified the public interactions and screenshots. Paid local testing does not automatically activate live public AI; that would require compute hosting, durable spending controls, and a separately validated configuration.</w:t>
+        <w:t>The static bundle contains six allowlisted files and no credentials. HF reported RUNNING with the static SDK. The deployment checkpoint passed 143 database-enabled tests; the final hardened code passed 156 database-enabled tests on October 16, 2026. A browser walkthrough verified the public interactions and screenshots. The owner chose the free static portfolio showcase so visitors can understand the project without generating paid model calls. Live public AI is intentionally excluded from this delivery.</w:t>
       </w:r>
     </w:p>
     <w:p>
@@ -4565,27 +4575,7 @@
     </w:p>
     <w:p>
       <w:r>
-        <w:t xml:space="preserve">Each verified checkpoint has a commit and a stacked draft pull request. Earlier draft PRs remain unmerged unless a later explicit integration record establishes otherwise. The published deployment checkpoint is branch </w:t>
-      </w:r>
-      <w:r>
-        <w:rPr>
-          <w:rFonts w:ascii="DejaVu Sans Mono" w:hAnsi="DejaVu Sans Mono"/>
-          <w:sz w:val="18"/>
-        </w:rPr>
-        <w:t>codex/step-17-deploy</w:t>
-      </w:r>
-      <w:r>
-        <w:t xml:space="preserve">, commit </w:t>
-      </w:r>
-      <w:r>
-        <w:rPr>
-          <w:rFonts w:ascii="DejaVu Sans Mono" w:hAnsi="DejaVu Sans Mono"/>
-          <w:sz w:val="18"/>
-        </w:rPr>
-        <w:t>dfbe933</w:t>
-      </w:r>
-      <w:r>
-        <w:t xml:space="preserve">. Clone that implementation branch; </w:t>
+        <w:t xml:space="preserve">The cumulative implementation was merged through PR 18 into </w:t>
       </w:r>
       <w:r>
         <w:rPr>
@@ -4595,7 +4585,27 @@
         <w:t>main</w:t>
       </w:r>
       <w:r>
-        <w:t xml:space="preserve"> still represents the initial setup until integration is explicitly recorded. Published branches and green CI are different facts from merged/released status.</w:t>
+        <w:t xml:space="preserve"> at commit </w:t>
+      </w:r>
+      <w:r>
+        <w:rPr>
+          <w:rFonts w:ascii="DejaVu Sans Mono" w:hAnsi="DejaVu Sans Mono"/>
+          <w:sz w:val="18"/>
+        </w:rPr>
+        <w:t>16c0527</w:t>
+      </w:r>
+      <w:r>
+        <w:t xml:space="preserve">. Clone </w:t>
+      </w:r>
+      <w:r>
+        <w:rPr>
+          <w:rFonts w:ascii="DejaVu Sans Mono" w:hAnsi="DejaVu Sans Mono"/>
+          <w:sz w:val="18"/>
+        </w:rPr>
+        <w:t>main</w:t>
+      </w:r>
+      <w:r>
+        <w:t xml:space="preserve"> for the integrated project. Earlier stacked checkpoints preserve the build history; they are not separate unimplemented features. The public deployment intentionally remains a free static showcase with saved examples.</w:t>
       </w:r>
     </w:p>
     <w:p>
@@ -4843,7 +4853,7 @@
     </w:p>
     <w:p>
       <w:r>
-        <w:t>Implementation branch: https://github.com/karthikeyansett1/medicare-claims/tree/codex/step-17-deploy</w:t>
+        <w:t>Integrated project: https://github.com/karthikeyansett1/medicare-claims/tree/main</w:t>
       </w:r>
     </w:p>
     <w:p>

</xml_diff>